<commit_message>
Refine portfolio content and update resume
</commit_message>
<xml_diff>
--- a/docs/AlexKourkoumelisResume.docx
+++ b/docs/AlexKourkoumelisResume.docx
@@ -130,11 +130,9 @@
       </w:r>
     </w:p>
     <w:p>
-      <w:pPr>
-        <w:pStyle w:val="ListBullet"/>
-      </w:pPr>
+      <w:pPr/>
       <w:r>
-        <w:t>Own frontend architecture for two customer-facing applications supporting 10 life insurance policy types. Together, they handled approximately 128,000 user actions in August 2026.</w:t>
+        <w:t>Lead frontend development for customer-facing life insurance applications covering policy servicing and digital claims across 10 policy types. Roughly 128,000 user actions per month.</w:t>
       </w:r>
     </w:p>
     <w:p>
@@ -142,7 +140,7 @@
         <w:pStyle w:val="ListBullet"/>
       </w:pPr>
       <w:r>
-        <w:t>Consolidated transaction flows from two repositories into a shared structure that grew from four flows to nine. Designed API contracts with backend engineers, including endpoints that combine data from multiple services.</w:t>
+        <w:t>Led frontend delivery of an in-house beneficiary change flow to replace an off-site vendor experience. Shipped simpler changes first to reduce manual handling, then expanded to estates, trusts, and organizations, enabling retirement of the vendor contract.</w:t>
       </w:r>
     </w:p>
     <w:p>
@@ -150,7 +148,7 @@
         <w:pStyle w:val="ListBullet"/>
       </w:pPr>
       <w:r>
-        <w:t>Migrated both applications from Create React App to Vite and from React 18 to 19. In the 30-day windows before and after the Vite release, p75 page load fell about 40% while traffic roughly doubled.</w:t>
+        <w:t>Migrated both applications from Create React App to Vite and from React 18 to 19. Observed about 40% lower p75 page load in the 30 days after the Vite release compared with the preceding 30 days.</w:t>
       </w:r>
     </w:p>
     <w:p>
@@ -158,7 +156,7 @@
         <w:pStyle w:val="ListBullet"/>
       </w:pPr>
       <w:r>
-        <w:t>Led the TypeScript and corporate design-system migration for the policy-servicing application, released in August 2026.</w:t>
+        <w:t>Mentor six engineers through design and code reviews; interviewed 10+ candidates and onboarded four.</w:t>
       </w:r>
     </w:p>
     <w:p>
@@ -166,7 +164,7 @@
         <w:pStyle w:val="ListBullet"/>
       </w:pPr>
       <w:r>
-        <w:t>Rebuilt the beneficiary change flow through five design iterations informed by user research, adding support for estates, trusts, and organizations.</w:t>
+        <w:t>Consolidated four flows across two repositories into a shared structure that now supports nine.</w:t>
       </w:r>
     </w:p>
     <w:p>
@@ -174,7 +172,7 @@
         <w:pStyle w:val="ListBullet"/>
       </w:pPr>
       <w:r>
-        <w:t>Set coding and review standards, built automated quality checks, and led accessibility fixes based on company audits.</w:t>
+        <w:t>Led TypeScript and corporate design-system migration for policy servicing, released August 2026.</w:t>
       </w:r>
     </w:p>
     <w:p>
@@ -182,7 +180,15 @@
         <w:pStyle w:val="ListBullet"/>
       </w:pPr>
       <w:r>
-        <w:t>Mentor six engineers through design and code reviews. Interviewed at least ten candidates and onboarded four engineers.</w:t>
+        <w:t>Built automated checks for types, tests, and design-system compatibility; led accessibility fixes from company audits.</w:t>
+      </w:r>
+    </w:p>
+    <w:p>
+      <w:pPr>
+        <w:pStyle w:val="ListBullet"/>
+      </w:pPr>
+      <w:r>
+        <w:t>Helped plan AI adoption across Engineering and Technology, including coding agents and MCP servers. Co-developed AGENTS.md project guidance and reusable agent skills, and trained engineers to apply them and establish development guardrails.</w:t>
       </w:r>
     </w:p>
     <w:p>

</xml_diff>

<commit_message>
Condense State Farm experience to five focused bullets
</commit_message>
<xml_diff>
--- a/docs/AlexKourkoumelisResume.docx
+++ b/docs/AlexKourkoumelisResume.docx
@@ -140,7 +140,7 @@
         <w:pStyle w:val="ListBullet"/>
       </w:pPr>
       <w:r>
-        <w:t>Led frontend delivery of an in-house beneficiary change flow to replace an off-site vendor experience. Shipped simpler changes first to reduce manual handling, then expanded to estates, trusts, and organizations, enabling retirement of the vendor contract.</w:t>
+        <w:t>Led the consolidation of policy-servicing projects into a shared repository, designing a modular frontend structure and engineering conventions for adding and maintaining customer transaction flows.</w:t>
       </w:r>
     </w:p>
     <w:p>
@@ -148,7 +148,15 @@
         <w:pStyle w:val="ListBullet"/>
       </w:pPr>
       <w:r>
-        <w:t>Migrated both applications from Create React App to Vite and from React 18 to 19. Observed about 40% lower p75 page load in the 30 days after the Vite release compared with the preceding 30 days.</w:t>
+        <w:t>Built a shared React component library used across the team’s flows to standardize layout and accessibility. Presented the approach to department leadership.</w:t>
+      </w:r>
+    </w:p>
+    <w:p>
+      <w:pPr>
+        <w:pStyle w:val="ListBullet"/>
+      </w:pPr>
+      <w:r>
+        <w:t>Modernized customer-facing life insurance applications with Vite and React 19, including a TypeScript and corporate design-system migration for policy servicing.</w:t>
       </w:r>
     </w:p>
     <w:p>
@@ -164,31 +172,7 @@
         <w:pStyle w:val="ListBullet"/>
       </w:pPr>
       <w:r>
-        <w:t>Consolidated four flows across two repositories into a shared structure that now supports nine.</w:t>
-      </w:r>
-    </w:p>
-    <w:p>
-      <w:pPr>
-        <w:pStyle w:val="ListBullet"/>
-      </w:pPr>
-      <w:r>
-        <w:t>Led TypeScript and corporate design-system migration for policy servicing, released August 2026.</w:t>
-      </w:r>
-    </w:p>
-    <w:p>
-      <w:pPr>
-        <w:pStyle w:val="ListBullet"/>
-      </w:pPr>
-      <w:r>
-        <w:t>Built automated checks for types, tests, and design-system compatibility; led accessibility fixes from company audits.</w:t>
-      </w:r>
-    </w:p>
-    <w:p>
-      <w:pPr>
-        <w:pStyle w:val="ListBullet"/>
-      </w:pPr>
-      <w:r>
-        <w:t>Helped plan AI adoption across Engineering and Technology, including coding agents and MCP servers. Co-developed AGENTS.md project guidance and reusable agent skills, and trained engineers to apply them and establish development guardrails.</w:t>
+        <w:t>Helped plan AI adoption across Engineering and Technology, including coding agents and MCP servers. Co-developed project guidance and reusable agent skills, and trained engineers to apply them and establish development guardrails.</w:t>
       </w:r>
     </w:p>
     <w:p>

</xml_diff>